<commit_message>
Enhance report data structure and template for Extension Seguro with additional fields and improved error handling. SCRUM-108
</commit_message>
<xml_diff>
--- a/Backend/Reports/Templates/extension_seguro.docx
+++ b/Backend/Reports/Templates/extension_seguro.docx
@@ -15,18 +15,15 @@
           <w:sz w:val="22"/>
           <w:szCs w:val="22"/>
         </w:rPr>
-        <w:t xml:space="preserve">San Miguel de Tucumán, </w:t>
-      </w:r>
-      <w:r>
-        <w:rPr>
-          <w:color w:val="FF0000"/>
-          <w:sz w:val="22"/>
-          <w:szCs w:val="22"/>
-          <w:lang w:val="es-AR"/>
-        </w:rPr>
-        <w:t>{{</w:t>
-      </w:r>
-      <w:proofErr w:type="spellStart"/>
+        <w:t>San Miguel de Tucumán,</w:t>
+      </w:r>
+      <w:r>
+        <w:rPr>
+          <w:sz w:val="22"/>
+          <w:szCs w:val="22"/>
+        </w:rPr>
+        <w:t xml:space="preserve"> </w:t>
+      </w:r>
       <w:sdt>
         <w:sdtPr>
           <w:rPr>
@@ -44,6 +41,7 @@
           <w:text/>
         </w:sdtPr>
         <w:sdtContent>
+          <w:proofErr w:type="spellStart"/>
           <w:r>
             <w:rPr>
               <w:color w:val="FF0000"/>
@@ -58,29 +56,11 @@
       </w:sdt>
       <w:r>
         <w:rPr>
-          <w:color w:val="FF0000"/>
-          <w:sz w:val="22"/>
-          <w:szCs w:val="22"/>
-          <w:lang w:val="es-AR"/>
-        </w:rPr>
-        <w:t>}}</w:t>
-      </w:r>
-      <w:r>
-        <w:rPr>
           <w:sz w:val="22"/>
           <w:szCs w:val="22"/>
         </w:rPr>
         <w:t xml:space="preserve"> de </w:t>
       </w:r>
-      <w:r>
-        <w:rPr>
-          <w:color w:val="FF0000"/>
-          <w:sz w:val="22"/>
-          <w:szCs w:val="22"/>
-        </w:rPr>
-        <w:t>{{</w:t>
-      </w:r>
-      <w:proofErr w:type="spellStart"/>
       <w:sdt>
         <w:sdtPr>
           <w:rPr>
@@ -97,6 +77,7 @@
           <w:text/>
         </w:sdtPr>
         <w:sdtContent>
+          <w:proofErr w:type="spellStart"/>
           <w:r>
             <w:rPr>
               <w:color w:val="FF0000"/>
@@ -110,28 +91,11 @@
       </w:sdt>
       <w:r>
         <w:rPr>
-          <w:color w:val="FF0000"/>
-          <w:sz w:val="22"/>
-          <w:szCs w:val="22"/>
-        </w:rPr>
-        <w:t>}}</w:t>
-      </w:r>
-      <w:r>
-        <w:rPr>
           <w:sz w:val="22"/>
           <w:szCs w:val="22"/>
         </w:rPr>
         <w:t xml:space="preserve"> de </w:t>
       </w:r>
-      <w:r>
-        <w:rPr>
-          <w:color w:val="FF0000"/>
-          <w:sz w:val="22"/>
-          <w:szCs w:val="22"/>
-        </w:rPr>
-        <w:t>{{</w:t>
-      </w:r>
-      <w:proofErr w:type="spellStart"/>
       <w:sdt>
         <w:sdtPr>
           <w:rPr>
@@ -148,6 +112,7 @@
           <w:text/>
         </w:sdtPr>
         <w:sdtContent>
+          <w:proofErr w:type="spellStart"/>
           <w:r>
             <w:rPr>
               <w:color w:val="FF0000"/>
@@ -159,14 +124,6 @@
           <w:proofErr w:type="spellEnd"/>
         </w:sdtContent>
       </w:sdt>
-      <w:r>
-        <w:rPr>
-          <w:color w:val="FF0000"/>
-          <w:sz w:val="22"/>
-          <w:szCs w:val="22"/>
-        </w:rPr>
-        <w:t>}}</w:t>
-      </w:r>
     </w:p>
     <w:p>
       <w:pPr>
@@ -384,7 +341,6 @@
           </w:placeholder>
           <w:text/>
         </w:sdtPr>
-        <w:sdtEndPr/>
         <w:sdtContent>
           <w:proofErr w:type="spellStart"/>
           <w:r>
@@ -1021,56 +977,36 @@
           <w:sz w:val="22"/>
           <w:szCs w:val="22"/>
         </w:rPr>
-        <w:t>:</w:t>
-      </w:r>
-      <w:r>
-        <w:rPr>
-          <w:color w:val="FF0000"/>
-          <w:sz w:val="22"/>
-          <w:szCs w:val="22"/>
-        </w:rPr>
         <w:t xml:space="preserve"> </w:t>
       </w:r>
-      <w:r>
-        <w:rPr>
-          <w:color w:val="FF0000"/>
-          <w:sz w:val="22"/>
-          <w:szCs w:val="22"/>
-        </w:rPr>
-        <w:t>(</w:t>
-      </w:r>
-      <w:r>
-        <w:rPr>
-          <w:color w:val="FF0000"/>
-          <w:sz w:val="22"/>
-          <w:szCs w:val="22"/>
-        </w:rPr>
-        <w:t>Direcci</w:t>
-      </w:r>
-      <w:r>
-        <w:rPr>
-          <w:color w:val="FF0000"/>
-          <w:sz w:val="22"/>
-          <w:szCs w:val="22"/>
-        </w:rPr>
-        <w:t>ó</w:t>
-      </w:r>
-      <w:r>
-        <w:rPr>
-          <w:color w:val="FF0000"/>
-          <w:sz w:val="22"/>
-          <w:szCs w:val="22"/>
-        </w:rPr>
-        <w:t>n donde podrán realizarse otras actividades</w:t>
-      </w:r>
-      <w:r>
-        <w:rPr>
-          <w:color w:val="FF0000"/>
-          <w:sz w:val="22"/>
-          <w:szCs w:val="22"/>
-        </w:rPr>
-        <w:t>)</w:t>
-      </w:r>
+      <w:sdt>
+        <w:sdtPr>
+          <w:rPr>
+            <w:color w:val="FF0000"/>
+            <w:sz w:val="22"/>
+            <w:szCs w:val="22"/>
+          </w:rPr>
+          <w:alias w:val="ConvenioDomicilioAlternativo"/>
+          <w:tag w:val="ConvenioDomicilioAlternativo"/>
+          <w:id w:val="1451828527"/>
+          <w:placeholder>
+            <w:docPart w:val="DefaultPlaceholder_-1854013440"/>
+          </w:placeholder>
+          <w:text/>
+        </w:sdtPr>
+        <w:sdtContent>
+          <w:proofErr w:type="spellStart"/>
+          <w:r>
+            <w:rPr>
+              <w:color w:val="FF0000"/>
+              <w:sz w:val="22"/>
+              <w:szCs w:val="22"/>
+            </w:rPr>
+            <w:t>ConvenioDomicilioAlternativo</w:t>
+          </w:r>
+          <w:proofErr w:type="spellEnd"/>
+        </w:sdtContent>
+      </w:sdt>
       <w:r>
         <w:rPr>
           <w:color w:val="FF0000"/>
@@ -1146,7 +1082,7 @@
           <w:sz w:val="22"/>
           <w:szCs w:val="22"/>
         </w:rPr>
-        <w:t xml:space="preserve">, DNI: </w:t>
+        <w:t>, DNI:</w:t>
       </w:r>
       <w:r>
         <w:rPr>
@@ -1154,7 +1090,7 @@
           <w:sz w:val="22"/>
           <w:szCs w:val="22"/>
         </w:rPr>
-        <w:t>(</w:t>
+        <w:t xml:space="preserve"> </w:t>
       </w:r>
       <w:sdt>
         <w:sdtPr>
@@ -1163,63 +1099,27 @@
             <w:sz w:val="22"/>
             <w:szCs w:val="22"/>
           </w:rPr>
-          <w:id w:val="381298288"/>
+          <w:alias w:val="DNITutorFacultad"/>
+          <w:tag w:val="DNITutorFacultad"/>
+          <w:id w:val="-1824732948"/>
           <w:placeholder>
             <w:docPart w:val="DefaultPlaceholder_-1854013440"/>
           </w:placeholder>
           <w:text/>
         </w:sdtPr>
         <w:sdtContent>
+          <w:proofErr w:type="spellStart"/>
           <w:r>
             <w:rPr>
               <w:color w:val="FF0000"/>
               <w:sz w:val="22"/>
               <w:szCs w:val="22"/>
             </w:rPr>
-            <w:t>Nro</w:t>
+            <w:t>DNITutorFacultad</w:t>
           </w:r>
-          <w:r>
-            <w:rPr>
-              <w:color w:val="FF0000"/>
-              <w:sz w:val="22"/>
-              <w:szCs w:val="22"/>
-            </w:rPr>
-            <w:t>.</w:t>
-          </w:r>
-          <w:r>
-            <w:rPr>
-              <w:color w:val="FF0000"/>
-              <w:sz w:val="22"/>
-              <w:szCs w:val="22"/>
-            </w:rPr>
-            <w:t xml:space="preserve"> de Docume</w:t>
-          </w:r>
-          <w:r>
-            <w:rPr>
-              <w:color w:val="FF0000"/>
-              <w:sz w:val="22"/>
-              <w:szCs w:val="22"/>
-            </w:rPr>
-            <w:t>nto del Tutor por parte de la FA</w:t>
-          </w:r>
-          <w:r>
-            <w:rPr>
-              <w:color w:val="FF0000"/>
-              <w:sz w:val="22"/>
-              <w:szCs w:val="22"/>
-            </w:rPr>
-            <w:t>CET</w:t>
-          </w:r>
+          <w:proofErr w:type="spellEnd"/>
         </w:sdtContent>
       </w:sdt>
-      <w:r>
-        <w:rPr>
-          <w:color w:val="FF0000"/>
-          <w:sz w:val="22"/>
-          <w:szCs w:val="22"/>
-        </w:rPr>
-        <w:t>)</w:t>
-      </w:r>
       <w:r>
         <w:rPr>
           <w:sz w:val="22"/>
@@ -2596,6 +2496,7 @@
   <w:style w:type="character" w:default="1" w:styleId="DefaultParagraphFont">
     <w:name w:val="Default Paragraph Font"/>
     <w:uiPriority w:val="1"/>
+    <w:semiHidden/>
     <w:unhideWhenUsed/>
   </w:style>
   <w:style w:type="table" w:default="1" w:styleId="TableNormal">
@@ -2868,8 +2769,11 @@
   <w:rsids>
     <w:rsidRoot w:val="009F3EF8"/>
     <w:rsid w:val="005F5FF0"/>
+    <w:rsid w:val="006058DD"/>
     <w:rsid w:val="00632125"/>
+    <w:rsid w:val="007472DD"/>
     <w:rsid w:val="009F3EF8"/>
+    <w:rsid w:val="00A7542E"/>
   </w:rsids>
   <m:mathPr>
     <m:mathFont m:val="Cambria Math"/>

</xml_diff>

<commit_message>
Add new fields to ReportData and update related logic in ExtensionSeguroReportRenderer and ReportDataFactory; modify template for alternative address and tutor DNI. SCRUM-147
</commit_message>
<xml_diff>
--- a/Backend/Reports/Templates/extension_seguro.docx
+++ b/Backend/Reports/Templates/extension_seguro.docx
@@ -17,16 +17,6 @@
         </w:rPr>
         <w:t xml:space="preserve">San Miguel de Tucumán, </w:t>
       </w:r>
-      <w:r>
-        <w:rPr>
-          <w:color w:val="FF0000"/>
-          <w:sz w:val="22"/>
-          <w:szCs w:val="22"/>
-          <w:lang w:val="es-AR"/>
-        </w:rPr>
-        <w:t>{{</w:t>
-      </w:r>
-      <w:proofErr w:type="spellStart"/>
       <w:sdt>
         <w:sdtPr>
           <w:rPr>
@@ -53,34 +43,15 @@
             </w:rPr>
             <w:t>diaHoy</w:t>
           </w:r>
-          <w:proofErr w:type="spellEnd"/>
         </w:sdtContent>
       </w:sdt>
       <w:r>
         <w:rPr>
-          <w:color w:val="FF0000"/>
-          <w:sz w:val="22"/>
-          <w:szCs w:val="22"/>
-          <w:lang w:val="es-AR"/>
-        </w:rPr>
-        <w:t>}}</w:t>
-      </w:r>
-      <w:r>
-        <w:rPr>
           <w:sz w:val="22"/>
           <w:szCs w:val="22"/>
         </w:rPr>
         <w:t xml:space="preserve"> de </w:t>
       </w:r>
-      <w:r>
-        <w:rPr>
-          <w:color w:val="FF0000"/>
-          <w:sz w:val="22"/>
-          <w:szCs w:val="22"/>
-        </w:rPr>
-        <w:t>{{</w:t>
-      </w:r>
-      <w:proofErr w:type="spellStart"/>
       <w:sdt>
         <w:sdtPr>
           <w:rPr>
@@ -105,33 +76,15 @@
             </w:rPr>
             <w:t>MesHoy</w:t>
           </w:r>
-          <w:proofErr w:type="spellEnd"/>
         </w:sdtContent>
       </w:sdt>
       <w:r>
         <w:rPr>
-          <w:color w:val="FF0000"/>
-          <w:sz w:val="22"/>
-          <w:szCs w:val="22"/>
-        </w:rPr>
-        <w:t>}}</w:t>
-      </w:r>
-      <w:r>
-        <w:rPr>
           <w:sz w:val="22"/>
           <w:szCs w:val="22"/>
         </w:rPr>
         <w:t xml:space="preserve"> de </w:t>
       </w:r>
-      <w:r>
-        <w:rPr>
-          <w:color w:val="FF0000"/>
-          <w:sz w:val="22"/>
-          <w:szCs w:val="22"/>
-        </w:rPr>
-        <w:t>{{</w:t>
-      </w:r>
-      <w:proofErr w:type="spellStart"/>
       <w:sdt>
         <w:sdtPr>
           <w:rPr>
@@ -156,17 +109,8 @@
             </w:rPr>
             <w:t>AñoHoy</w:t>
           </w:r>
-          <w:proofErr w:type="spellEnd"/>
         </w:sdtContent>
       </w:sdt>
-      <w:r>
-        <w:rPr>
-          <w:color w:val="FF0000"/>
-          <w:sz w:val="22"/>
-          <w:szCs w:val="22"/>
-        </w:rPr>
-        <w:t>}}</w:t>
-      </w:r>
     </w:p>
     <w:p>
       <w:pPr>
@@ -384,9 +328,7 @@
           </w:placeholder>
           <w:text/>
         </w:sdtPr>
-        <w:sdtEndPr/>
         <w:sdtContent>
-          <w:proofErr w:type="spellStart"/>
           <w:r>
             <w:rPr>
               <w:color w:val="FF0000"/>
@@ -396,7 +338,6 @@
             </w:rPr>
             <w:t>ConvenioRepresentanteFacultad</w:t>
           </w:r>
-          <w:proofErr w:type="spellEnd"/>
         </w:sdtContent>
       </w:sdt>
       <w:r>
@@ -436,7 +377,6 @@
           <w:text/>
         </w:sdtPr>
         <w:sdtContent>
-          <w:proofErr w:type="spellStart"/>
           <w:r>
             <w:rPr>
               <w:color w:val="FF0000"/>
@@ -445,7 +385,6 @@
             </w:rPr>
             <w:t>EstudianteCarrera</w:t>
           </w:r>
-          <w:proofErr w:type="spellEnd"/>
         </w:sdtContent>
       </w:sdt>
       <w:r>
@@ -492,7 +431,6 @@
           <w:text/>
         </w:sdtPr>
         <w:sdtContent>
-          <w:proofErr w:type="spellStart"/>
           <w:r>
             <w:rPr>
               <w:color w:val="FF0000"/>
@@ -501,7 +439,6 @@
             </w:rPr>
             <w:t>EstudianteNombre</w:t>
           </w:r>
-          <w:proofErr w:type="spellEnd"/>
         </w:sdtContent>
       </w:sdt>
       <w:r>
@@ -527,7 +464,6 @@
           <w:text/>
         </w:sdtPr>
         <w:sdtContent>
-          <w:proofErr w:type="spellStart"/>
           <w:r>
             <w:rPr>
               <w:color w:val="FF0000"/>
@@ -536,7 +472,6 @@
             </w:rPr>
             <w:t>EstudianteDNI</w:t>
           </w:r>
-          <w:proofErr w:type="spellEnd"/>
         </w:sdtContent>
       </w:sdt>
       <w:r>
@@ -576,7 +511,6 @@
           <w:text/>
         </w:sdtPr>
         <w:sdtContent>
-          <w:proofErr w:type="spellStart"/>
           <w:r>
             <w:rPr>
               <w:color w:val="FF0000"/>
@@ -585,7 +519,6 @@
             </w:rPr>
             <w:t>EstudianteCarrera</w:t>
           </w:r>
-          <w:proofErr w:type="spellEnd"/>
         </w:sdtContent>
       </w:sdt>
       <w:r>
@@ -722,23 +655,7 @@
           <w:sz w:val="22"/>
           <w:szCs w:val="22"/>
         </w:rPr>
-        <w:t xml:space="preserve">rá una carga horaria de 200 </w:t>
-      </w:r>
-      <w:proofErr w:type="spellStart"/>
-      <w:r>
-        <w:rPr>
-          <w:sz w:val="22"/>
-          <w:szCs w:val="22"/>
-        </w:rPr>
-        <w:t>hs</w:t>
-      </w:r>
-      <w:proofErr w:type="spellEnd"/>
-      <w:r>
-        <w:rPr>
-          <w:sz w:val="22"/>
-          <w:szCs w:val="22"/>
-        </w:rPr>
-        <w:t>.</w:t>
+        <w:t>rá una carga horaria de 200 hs.</w:t>
       </w:r>
       <w:r>
         <w:rPr>
@@ -792,7 +709,6 @@
           <w:text/>
         </w:sdtPr>
         <w:sdtContent>
-          <w:proofErr w:type="spellStart"/>
           <w:r>
             <w:rPr>
               <w:color w:val="FF0000"/>
@@ -801,7 +717,6 @@
             </w:rPr>
             <w:t>FechaInicio</w:t>
           </w:r>
-          <w:proofErr w:type="spellEnd"/>
         </w:sdtContent>
       </w:sdt>
       <w:r>
@@ -835,7 +750,6 @@
           <w:text/>
         </w:sdtPr>
         <w:sdtContent>
-          <w:proofErr w:type="spellStart"/>
           <w:r>
             <w:rPr>
               <w:color w:val="FF0000"/>
@@ -844,7 +758,6 @@
             </w:rPr>
             <w:t>FechaFin</w:t>
           </w:r>
-          <w:proofErr w:type="spellEnd"/>
         </w:sdtContent>
       </w:sdt>
       <w:r>
@@ -893,7 +806,6 @@
           <w:text/>
         </w:sdtPr>
         <w:sdtContent>
-          <w:proofErr w:type="spellStart"/>
           <w:r>
             <w:rPr>
               <w:color w:val="FF0000"/>
@@ -902,7 +814,6 @@
             </w:rPr>
             <w:t>EmpresaNombre</w:t>
           </w:r>
-          <w:proofErr w:type="spellEnd"/>
         </w:sdtContent>
       </w:sdt>
       <w:r>
@@ -935,7 +846,6 @@
           <w:text/>
         </w:sdtPr>
         <w:sdtContent>
-          <w:proofErr w:type="spellStart"/>
           <w:r>
             <w:rPr>
               <w:color w:val="FF0000"/>
@@ -944,7 +854,6 @@
             </w:rPr>
             <w:t>ConvenioDomicilioLegal</w:t>
           </w:r>
-          <w:proofErr w:type="spellEnd"/>
         </w:sdtContent>
       </w:sdt>
       <w:r>
@@ -972,26 +881,22 @@
           <w:color w:val="FF0000"/>
           <w:sz w:val="22"/>
           <w:szCs w:val="22"/>
-        </w:rPr>
-      </w:pPr>
-      <w:r>
-        <w:rPr>
-          <w:sz w:val="22"/>
-          <w:szCs w:val="22"/>
-        </w:rPr>
-        <w:t>D</w:t>
-      </w:r>
-      <w:r>
-        <w:rPr>
-          <w:sz w:val="22"/>
-          <w:szCs w:val="22"/>
-        </w:rPr>
-        <w:t>irecc</w:t>
-      </w:r>
-      <w:r>
-        <w:rPr>
-          <w:sz w:val="22"/>
-          <w:szCs w:val="22"/>
+          <w:lang w:val="es-AR"/>
+        </w:rPr>
+      </w:pPr>
+      <w:r>
+        <w:rPr>
+          <w:sz w:val="22"/>
+          <w:szCs w:val="22"/>
+          <w:lang w:val="es-AR"/>
+        </w:rPr>
+        <w:t>Direcc</w:t>
+      </w:r>
+      <w:r>
+        <w:rPr>
+          <w:sz w:val="22"/>
+          <w:szCs w:val="22"/>
+          <w:lang w:val="es-AR"/>
         </w:rPr>
         <w:t>iones</w:t>
       </w:r>
@@ -999,86 +904,61 @@
         <w:rPr>
           <w:sz w:val="22"/>
           <w:szCs w:val="22"/>
+          <w:lang w:val="es-AR"/>
+        </w:rPr>
+        <w:t xml:space="preserve"> alternativa</w:t>
+      </w:r>
+      <w:r>
+        <w:rPr>
+          <w:sz w:val="22"/>
+          <w:szCs w:val="22"/>
+          <w:lang w:val="es-AR"/>
+        </w:rPr>
+        <w:t>s</w:t>
+      </w:r>
+      <w:r>
+        <w:rPr>
+          <w:sz w:val="22"/>
+          <w:szCs w:val="22"/>
+          <w:lang w:val="es-AR"/>
+        </w:rPr>
+        <w:t>:</w:t>
+      </w:r>
+      <w:r>
+        <w:rPr>
+          <w:color w:val="FF0000"/>
+          <w:sz w:val="22"/>
+          <w:szCs w:val="22"/>
+          <w:lang w:val="es-AR"/>
         </w:rPr>
         <w:t xml:space="preserve"> </w:t>
       </w:r>
-      <w:r>
-        <w:rPr>
-          <w:sz w:val="22"/>
-          <w:szCs w:val="22"/>
-        </w:rPr>
-        <w:t>alternativa</w:t>
-      </w:r>
-      <w:r>
-        <w:rPr>
-          <w:sz w:val="22"/>
-          <w:szCs w:val="22"/>
-        </w:rPr>
-        <w:t>s</w:t>
-      </w:r>
-      <w:r>
-        <w:rPr>
-          <w:sz w:val="22"/>
-          <w:szCs w:val="22"/>
-        </w:rPr>
-        <w:t>:</w:t>
-      </w:r>
-      <w:r>
-        <w:rPr>
-          <w:color w:val="FF0000"/>
-          <w:sz w:val="22"/>
-          <w:szCs w:val="22"/>
-        </w:rPr>
-        <w:t xml:space="preserve"> </w:t>
-      </w:r>
-      <w:r>
-        <w:rPr>
-          <w:color w:val="FF0000"/>
-          <w:sz w:val="22"/>
-          <w:szCs w:val="22"/>
-        </w:rPr>
-        <w:t>(</w:t>
-      </w:r>
-      <w:r>
-        <w:rPr>
-          <w:color w:val="FF0000"/>
-          <w:sz w:val="22"/>
-          <w:szCs w:val="22"/>
-        </w:rPr>
-        <w:t>Direcci</w:t>
-      </w:r>
-      <w:r>
-        <w:rPr>
-          <w:color w:val="FF0000"/>
-          <w:sz w:val="22"/>
-          <w:szCs w:val="22"/>
-        </w:rPr>
-        <w:t>ó</w:t>
-      </w:r>
-      <w:r>
-        <w:rPr>
-          <w:color w:val="FF0000"/>
-          <w:sz w:val="22"/>
-          <w:szCs w:val="22"/>
-        </w:rPr>
-        <w:t>n donde podrán realizarse otras actividades</w:t>
-      </w:r>
-      <w:r>
-        <w:rPr>
-          <w:color w:val="FF0000"/>
-          <w:sz w:val="22"/>
-          <w:szCs w:val="22"/>
-        </w:rPr>
-        <w:t>)</w:t>
-      </w:r>
-      <w:r>
-        <w:rPr>
-          <w:color w:val="FF0000"/>
-          <w:sz w:val="22"/>
-          <w:szCs w:val="22"/>
-        </w:rPr>
-        <w:t>.</w:t>
-      </w:r>
+      <w:sdt>
+        <w:sdtPr>
+          <w:rPr>
+            <w:color w:val="FF0000"/>
+            <w:sz w:val="22"/>
+            <w:szCs w:val="22"/>
+          </w:rPr>
+          <w:alias w:val="ConvenioDomicilioAlternativo"/>
+          <w:tag w:val="ConvenioDomicilioAlternativo"/>
+          <w:id w:val="-496805795"/>
+          <w:placeholder>
+            <w:docPart w:val="DefaultPlaceholder_-1854013440"/>
+          </w:placeholder>
+          <w:text/>
+        </w:sdtPr>
+        <w:sdtContent>
+          <w:r>
+            <w:rPr>
+              <w:color w:val="FF0000"/>
+              <w:sz w:val="22"/>
+              <w:szCs w:val="22"/>
+            </w:rPr>
+            <w:t>ConvenioDomicilioAlternativo</w:t>
+          </w:r>
+        </w:sdtContent>
+      </w:sdt>
     </w:p>
     <w:p>
       <w:pPr>
@@ -1129,7 +1009,6 @@
           <w:text/>
         </w:sdtPr>
         <w:sdtContent>
-          <w:proofErr w:type="spellStart"/>
           <w:r>
             <w:rPr>
               <w:color w:val="FF0000"/>
@@ -1138,7 +1017,6 @@
             </w:rPr>
             <w:t>TutorFacultad</w:t>
           </w:r>
-          <w:proofErr w:type="spellEnd"/>
         </w:sdtContent>
       </w:sdt>
       <w:r>
@@ -1146,7 +1024,7 @@
           <w:sz w:val="22"/>
           <w:szCs w:val="22"/>
         </w:rPr>
-        <w:t xml:space="preserve">, DNI: </w:t>
+        <w:t>, DNI:</w:t>
       </w:r>
       <w:r>
         <w:rPr>
@@ -1154,7 +1032,7 @@
           <w:sz w:val="22"/>
           <w:szCs w:val="22"/>
         </w:rPr>
-        <w:t>(</w:t>
+        <w:t xml:space="preserve"> </w:t>
       </w:r>
       <w:sdt>
         <w:sdtPr>
@@ -1163,7 +1041,9 @@
             <w:sz w:val="22"/>
             <w:szCs w:val="22"/>
           </w:rPr>
-          <w:id w:val="381298288"/>
+          <w:alias w:val="DNITutorFacultad"/>
+          <w:tag w:val="DNITutorFacultad"/>
+          <w:id w:val="574561066"/>
           <w:placeholder>
             <w:docPart w:val="DefaultPlaceholder_-1854013440"/>
           </w:placeholder>
@@ -1176,50 +1056,10 @@
               <w:sz w:val="22"/>
               <w:szCs w:val="22"/>
             </w:rPr>
-            <w:t>Nro</w:t>
-          </w:r>
-          <w:r>
-            <w:rPr>
-              <w:color w:val="FF0000"/>
-              <w:sz w:val="22"/>
-              <w:szCs w:val="22"/>
-            </w:rPr>
-            <w:t>.</w:t>
-          </w:r>
-          <w:r>
-            <w:rPr>
-              <w:color w:val="FF0000"/>
-              <w:sz w:val="22"/>
-              <w:szCs w:val="22"/>
-            </w:rPr>
-            <w:t xml:space="preserve"> de Docume</w:t>
-          </w:r>
-          <w:r>
-            <w:rPr>
-              <w:color w:val="FF0000"/>
-              <w:sz w:val="22"/>
-              <w:szCs w:val="22"/>
-            </w:rPr>
-            <w:t>nto del Tutor por parte de la FA</w:t>
-          </w:r>
-          <w:r>
-            <w:rPr>
-              <w:color w:val="FF0000"/>
-              <w:sz w:val="22"/>
-              <w:szCs w:val="22"/>
-            </w:rPr>
-            <w:t>CET</w:t>
+            <w:t>DNITutorFacultad</w:t>
           </w:r>
         </w:sdtContent>
       </w:sdt>
-      <w:r>
-        <w:rPr>
-          <w:color w:val="FF0000"/>
-          <w:sz w:val="22"/>
-          <w:szCs w:val="22"/>
-        </w:rPr>
-        <w:t>)</w:t>
-      </w:r>
       <w:r>
         <w:rPr>
           <w:sz w:val="22"/>
@@ -2596,6 +2436,7 @@
   <w:style w:type="character" w:default="1" w:styleId="DefaultParagraphFont">
     <w:name w:val="Default Paragraph Font"/>
     <w:uiPriority w:val="1"/>
+    <w:semiHidden/>
     <w:unhideWhenUsed/>
   </w:style>
   <w:style w:type="table" w:default="1" w:styleId="TableNormal">
@@ -2867,9 +2708,13 @@
   </w:compat>
   <w:rsids>
     <w:rsidRoot w:val="009F3EF8"/>
+    <w:rsid w:val="00024384"/>
+    <w:rsid w:val="00233D86"/>
     <w:rsid w:val="005F5FF0"/>
     <w:rsid w:val="00632125"/>
     <w:rsid w:val="009F3EF8"/>
+    <w:rsid w:val="00CF44B3"/>
+    <w:rsid w:val="00E823E2"/>
   </w:rsids>
   <m:mathPr>
     <m:mathFont m:val="Cambria Math"/>

</xml_diff>